<commit_message>
Removed nice because boss said so
</commit_message>
<xml_diff>
--- a/git cammands.docx
+++ b/git cammands.docx
@@ -166,46 +166,57 @@
     </w:p>
     <w:p>
       <w:r>
-        <w:t xml:space="preserve">To move from staged to </w:t>
-      </w:r>
-      <w:proofErr w:type="spellStart"/>
-      <w:r>
-        <w:t>unstage</w:t>
-      </w:r>
-      <w:proofErr w:type="spellEnd"/>
-      <w:r>
-        <w:t xml:space="preserve"> modified  we execute</w:t>
-      </w:r>
-    </w:p>
-    <w:p>
-      <w:r>
+        <w:t>You will get above error i</w:t>
+      </w:r>
+      <w:r>
+        <w:t>f</w:t>
+      </w:r>
+      <w:r>
+        <w:t xml:space="preserve"> you try to restore untracked file </w:t>
+      </w:r>
+      <w:r>
+        <w:t>that is</w:t>
+      </w:r>
+      <w:r>
+        <w:t xml:space="preserve"> not tracked in</w:t>
+      </w:r>
+      <w:r>
+        <w:t xml:space="preserve"> </w:t>
+      </w:r>
+      <w:r>
+        <w:t>.</w:t>
+      </w:r>
+      <w:r>
+        <w:t>git folder</w:t>
+      </w:r>
+      <w:r>
+        <w:t xml:space="preserve"> and it</w:t>
+      </w:r>
+      <w:r>
+        <w:t xml:space="preserve"> does not know about it</w:t>
+      </w:r>
+      <w:r>
+        <w:t>.</w:t>
+      </w:r>
+    </w:p>
+    <w:p>
+      <w:r>
+        <w:t>To move from staged to unstage modified  we execute</w:t>
+      </w:r>
+    </w:p>
+    <w:p>
+      <w:pPr>
+        <w:rPr>
+          <w:b/>
+          <w:bCs/>
+        </w:rPr>
+      </w:pPr>
+      <w:r>
+        <w:rPr>
+          <w:b/>
+          <w:bCs/>
+        </w:rPr>
         <w:t>Git restore –staged &lt;filename&gt;</w:t>
-      </w:r>
-    </w:p>
-    <w:p>
-      <w:r>
-        <w:t>You will get above error i</w:t>
-      </w:r>
-      <w:r>
-        <w:t>f</w:t>
-      </w:r>
-      <w:r>
-        <w:t xml:space="preserve"> you try to restore untracked file </w:t>
-      </w:r>
-      <w:r>
-        <w:t>that is</w:t>
-      </w:r>
-      <w:r>
-        <w:t xml:space="preserve"> </w:t>
-      </w:r>
-      <w:r>
-        <w:t>.</w:t>
-      </w:r>
-      <w:r>
-        <w:t>git folder does not know about it</w:t>
-      </w:r>
-      <w:r>
-        <w:t>.</w:t>
       </w:r>
     </w:p>
     <w:p>
@@ -269,21 +280,12 @@
           <w:bCs/>
         </w:rPr>
       </w:pPr>
-      <w:proofErr w:type="spellStart"/>
-      <w:r>
-        <w:rPr>
-          <w:b/>
-          <w:bCs/>
-        </w:rPr>
-        <w:t>mkdir</w:t>
-      </w:r>
-      <w:proofErr w:type="spellEnd"/>
-      <w:r>
-        <w:rPr>
-          <w:b/>
-          <w:bCs/>
-        </w:rPr>
-        <w:t xml:space="preserve"> &lt;folder name&gt;</w:t>
+      <w:r>
+        <w:rPr>
+          <w:b/>
+          <w:bCs/>
+        </w:rPr>
+        <w:t>mkdir &lt;folder name&gt;</w:t>
       </w:r>
     </w:p>
     <w:p>
@@ -375,28 +377,113 @@
     </w:p>
     <w:p>
       <w:r>
-        <w:t xml:space="preserve">It compared its </w:t>
-      </w:r>
-      <w:proofErr w:type="spellStart"/>
-      <w:r>
-        <w:t>unstaged</w:t>
-      </w:r>
-      <w:proofErr w:type="spellEnd"/>
-      <w:r>
-        <w:t xml:space="preserve"> version to its staged version if there is no staged version then last commit </w:t>
-      </w:r>
-      <w:r>
-        <w:t xml:space="preserve">will be compared to </w:t>
-      </w:r>
-      <w:proofErr w:type="spellStart"/>
-      <w:r>
-        <w:t>unstaged</w:t>
-      </w:r>
-      <w:proofErr w:type="spellEnd"/>
-      <w:r>
-        <w:t xml:space="preserve"> version.</w:t>
-      </w:r>
-    </w:p>
+        <w:t xml:space="preserve">It compared its unstaged version to its staged version if there is no staged version then last commit </w:t>
+      </w:r>
+      <w:r>
+        <w:t>will be compared to unstaged version.</w:t>
+      </w:r>
+    </w:p>
+    <w:p>
+      <w:pPr>
+        <w:rPr>
+          <w:b/>
+          <w:bCs/>
+        </w:rPr>
+      </w:pPr>
+      <w:r>
+        <w:rPr>
+          <w:b/>
+          <w:bCs/>
+        </w:rPr>
+        <w:t xml:space="preserve">git diff </w:t>
+      </w:r>
+      <w:r>
+        <w:rPr>
+          <w:b/>
+          <w:bCs/>
+        </w:rPr>
+        <w:t>–</w:t>
+      </w:r>
+      <w:r>
+        <w:rPr>
+          <w:b/>
+          <w:bCs/>
+        </w:rPr>
+        <w:t>-</w:t>
+      </w:r>
+      <w:r>
+        <w:rPr>
+          <w:b/>
+          <w:bCs/>
+        </w:rPr>
+        <w:t>staged</w:t>
+      </w:r>
+    </w:p>
+    <w:p>
+      <w:r>
+        <w:t xml:space="preserve">see what you </w:t>
+      </w:r>
+      <w:r>
+        <w:t>changes you have done in staged area as compared to last commit</w:t>
+      </w:r>
+    </w:p>
+    <w:p>
+      <w:r>
+        <w:t>git diff HEAD~1 HEAD</w:t>
+      </w:r>
+    </w:p>
+    <w:p>
+      <w:r>
+        <w:lastRenderedPageBreak/>
+        <w:t xml:space="preserve">Compare the last commit with the </w:t>
+      </w:r>
+      <w:r>
+        <w:t>second last</w:t>
+      </w:r>
+      <w:r>
+        <w:t xml:space="preserve"> commit </w:t>
+      </w:r>
+    </w:p>
+    <w:p>
+      <w:r>
+        <w:t xml:space="preserve">Press </w:t>
+      </w:r>
+      <w:r>
+        <w:rPr>
+          <w:b/>
+          <w:bCs/>
+        </w:rPr>
+        <w:t>Q</w:t>
+      </w:r>
+      <w:r>
+        <w:t xml:space="preserve"> to quit the infinite loop of showing result.</w:t>
+      </w:r>
+    </w:p>
+    <w:p>
+      <w:r>
+        <w:t xml:space="preserve">Press </w:t>
+      </w:r>
+      <w:r>
+        <w:rPr>
+          <w:b/>
+          <w:bCs/>
+        </w:rPr>
+        <w:t>tab</w:t>
+      </w:r>
+      <w:r>
+        <w:t xml:space="preserve"> while typing command as it wil</w:t>
+      </w:r>
+      <w:r>
+        <w:t>l</w:t>
+      </w:r>
+      <w:r>
+        <w:t xml:space="preserve"> auto correct</w:t>
+      </w:r>
+      <w:r>
+        <w:t>.</w:t>
+      </w:r>
+    </w:p>
+    <w:p/>
     <w:sectPr>
       <w:pgSz w:w="11906" w:h="16838"/>
       <w:pgMar w:top="1440" w:right="1440" w:bottom="1440" w:left="1440" w:header="708" w:footer="708" w:gutter="0"/>
@@ -1010,6 +1097,7 @@
   <w:style w:type="character" w:default="1" w:styleId="DefaultParagraphFont">
     <w:name w:val="Default Paragraph Font"/>
     <w:uiPriority w:val="1"/>
+    <w:semiHidden/>
     <w:unhideWhenUsed/>
   </w:style>
   <w:style w:type="table" w:default="1" w:styleId="TableNormal">

</xml_diff>